<commit_message>
recopy dan pembuatan metode analitikal di lhp residu2
</commit_message>
<xml_diff>
--- a/manual.docx
+++ b/manual.docx
@@ -129,14 +129,8 @@
           <w:b/>
         </w:rPr>
       </w:pPr>
-    </w:p>
-    <w:p>
-      <w:pPr>
-        <w:pStyle w:val="BodyText"/>
-        <w:rPr>
-          <w:b/>
-        </w:rPr>
-      </w:pPr>
+      <w:bookmarkStart w:id="0" w:name="_GoBack"/>
+      <w:bookmarkEnd w:id="0"/>
     </w:p>
     <w:p>
       <w:pPr>
@@ -275,7 +269,7 @@
           <w:lang w:val="en-ID"/>
         </w:rPr>
       </w:pPr>
-      <w:bookmarkStart w:id="0" w:name="_Toc7482879"/>
+      <w:bookmarkStart w:id="1" w:name="_Toc7482879"/>
       <w:r>
         <w:rPr>
           <w:bCs w:val="0"/>
@@ -284,8 +278,8 @@
         </w:rPr>
         <w:t>MANUAL PENGGUNAAN APLIKASI</w:t>
       </w:r>
-      <w:bookmarkStart w:id="1" w:name="_Toc7482880"/>
-      <w:bookmarkEnd w:id="0"/>
+      <w:bookmarkStart w:id="2" w:name="_Toc7482880"/>
+      <w:bookmarkEnd w:id="1"/>
     </w:p>
     <w:p>
       <w:pPr>
@@ -304,7 +298,7 @@
         </w:rPr>
         <w:t>SISTEM INFORMASI PENGUJIAN LABORATORIUM</w:t>
       </w:r>
-      <w:bookmarkEnd w:id="1"/>
+      <w:bookmarkEnd w:id="2"/>
     </w:p>
     <w:p>
       <w:pPr>
@@ -313,7 +307,7 @@
           <w:lang w:val="en-ID"/>
         </w:rPr>
       </w:pPr>
-      <w:bookmarkStart w:id="2" w:name="_Toc7482881"/>
+      <w:bookmarkStart w:id="3" w:name="_Toc7482881"/>
       <w:r>
         <w:rPr>
           <w:noProof/>
@@ -364,7 +358,7 @@
           </wp:inline>
         </w:drawing>
       </w:r>
-      <w:bookmarkEnd w:id="2"/>
+      <w:bookmarkEnd w:id="3"/>
     </w:p>
     <w:p>
       <w:pPr>
@@ -393,7 +387,7 @@
           <w:lang w:val="en-ID"/>
         </w:rPr>
       </w:pPr>
-      <w:bookmarkStart w:id="3" w:name="_Toc7482882"/>
+      <w:bookmarkStart w:id="4" w:name="_Toc7482882"/>
       <w:proofErr w:type="spellStart"/>
       <w:r>
         <w:rPr>
@@ -409,10 +403,19 @@
         </w:rPr>
         <w:t xml:space="preserve"> Isi</w:t>
       </w:r>
-      <w:bookmarkEnd w:id="3"/>
+      <w:bookmarkEnd w:id="4"/>
     </w:p>
     <w:sdt>
       <w:sdtPr>
+        <w:rPr>
+          <w:rFonts w:asciiTheme="minorHAnsi" w:eastAsiaTheme="minorHAnsi" w:hAnsiTheme="minorHAnsi" w:cstheme="minorBidi"/>
+          <w:b w:val="0"/>
+          <w:bCs w:val="0"/>
+          <w:color w:val="auto"/>
+          <w:sz w:val="22"/>
+          <w:szCs w:val="22"/>
+          <w:lang w:eastAsia="en-US"/>
+        </w:rPr>
         <w:id w:val="-1802290808"/>
         <w:docPartObj>
           <w:docPartGallery w:val="Table of Contents"/>
@@ -421,17 +424,10 @@
       </w:sdtPr>
       <w:sdtEndPr>
         <w:rPr>
-          <w:rFonts w:asciiTheme="minorHAnsi" w:eastAsiaTheme="minorHAnsi" w:hAnsiTheme="minorHAnsi" w:cstheme="minorBidi"/>
           <w:noProof/>
-          <w:color w:val="auto"/>
-          <w:sz w:val="22"/>
-          <w:szCs w:val="22"/>
-          <w:lang w:eastAsia="en-US"/>
         </w:rPr>
       </w:sdtEndPr>
       <w:sdtContent>
-        <w:bookmarkStart w:id="4" w:name="_GoBack" w:displacedByCustomXml="prev"/>
-        <w:bookmarkEnd w:id="4" w:displacedByCustomXml="prev"/>
         <w:p>
           <w:pPr>
             <w:pStyle w:val="TOCHeading"/>
@@ -4510,19 +4506,7 @@
         <w:rPr>
           <w:lang w:val="en-ID"/>
         </w:rPr>
-        <w:t xml:space="preserve"> : &lt;</w:t>
-      </w:r>
-      <w:r>
-        <w:rPr>
-          <w:lang w:val="en-ID"/>
-        </w:rPr>
-        <w:t>i</w:t>
-      </w:r>
-      <w:r>
-        <w:rPr>
-          <w:lang w:val="en-ID"/>
-        </w:rPr>
-        <w:t>&gt;</w:t>
+        <w:t xml:space="preserve"> : &lt;i&gt;</w:t>
       </w:r>
       <w:proofErr w:type="spellStart"/>
       <w:r>
@@ -4536,19 +4520,7 @@
         <w:rPr>
           <w:lang w:val="en-ID"/>
         </w:rPr>
-        <w:t>&lt;/</w:t>
-      </w:r>
-      <w:r>
-        <w:rPr>
-          <w:lang w:val="en-ID"/>
-        </w:rPr>
-        <w:t>i</w:t>
-      </w:r>
-      <w:r>
-        <w:rPr>
-          <w:lang w:val="en-ID"/>
-        </w:rPr>
-        <w:t xml:space="preserve">&gt; , </w:t>
+        <w:t xml:space="preserve">&lt;/i&gt; , </w:t>
       </w:r>
       <w:proofErr w:type="spellStart"/>
       <w:r>
@@ -4620,7 +4592,7 @@
             <v:path o:extrusionok="f" gradientshapeok="t" o:connecttype="rect"/>
             <o:lock v:ext="edit" aspectratio="t"/>
           </v:shapetype>
-          <v:shape id="_x0000_i1026" type="#_x0000_t75" style="width:467.45pt;height:167.65pt">
+          <v:shape id="_x0000_i1025" type="#_x0000_t75" style="width:467.45pt;height:167.65pt">
             <v:imagedata r:id="rId15" o:title="miring_ifx"/>
           </v:shape>
         </w:pict>
@@ -5309,19 +5281,7 @@
         <w:rPr>
           <w:lang w:val="en-ID"/>
         </w:rPr>
-        <w:t xml:space="preserve"> menu </w:t>
-      </w:r>
-      <w:r>
-        <w:rPr>
-          <w:lang w:val="en-ID"/>
-        </w:rPr>
-        <w:t>Wo</w:t>
-      </w:r>
-      <w:r>
-        <w:rPr>
-          <w:lang w:val="en-ID"/>
-        </w:rPr>
-        <w:t xml:space="preserve">rk Area -&gt; </w:t>
+        <w:t xml:space="preserve"> menu Work Area -&gt; </w:t>
       </w:r>
       <w:proofErr w:type="spellStart"/>
       <w:r>
@@ -10570,7 +10530,7 @@
           <w:lang w:val="en-ID"/>
         </w:rPr>
         <w:pict>
-          <v:shape id="_x0000_i1025" type="#_x0000_t75" style="width:467.45pt;height:187pt">
+          <v:shape id="_x0000_i1026" type="#_x0000_t75" style="width:467.45pt;height:187pt">
             <v:imagedata r:id="rId28" o:title="pangkat_fix"/>
           </v:shape>
         </w:pict>
@@ -11312,13 +11272,7 @@
         <w:rPr>
           <w:lang w:val="en-ID"/>
         </w:rPr>
-        <w:t xml:space="preserve">lab </w:t>
-      </w:r>
-      <w:r>
-        <w:rPr>
-          <w:lang w:val="en-ID"/>
-        </w:rPr>
-        <w:t xml:space="preserve"> </w:t>
+        <w:t xml:space="preserve">lab  </w:t>
       </w:r>
       <w:proofErr w:type="spellStart"/>
       <w:r>
@@ -11445,13 +11399,7 @@
         <w:rPr>
           <w:lang w:val="en-ID"/>
         </w:rPr>
-        <w:t xml:space="preserve"> lab</w:t>
-      </w:r>
-      <w:r>
-        <w:rPr>
-          <w:lang w:val="en-ID"/>
-        </w:rPr>
-        <w:t>.</w:t>
+        <w:t xml:space="preserve"> lab.</w:t>
       </w:r>
     </w:p>
     <w:p>
@@ -11910,13 +11858,7 @@
         <w:rPr>
           <w:lang w:val="en-ID"/>
         </w:rPr>
-        <w:t xml:space="preserve"> </w:t>
-      </w:r>
-      <w:r>
-        <w:rPr>
-          <w:lang w:val="en-ID"/>
-        </w:rPr>
-        <w:t xml:space="preserve">master </w:t>
+        <w:t xml:space="preserve"> master </w:t>
       </w:r>
       <w:proofErr w:type="spellStart"/>
       <w:r>
@@ -12002,25 +11944,7 @@
         <w:rPr>
           <w:lang w:val="en-ID"/>
         </w:rPr>
-        <w:t xml:space="preserve"> menu </w:t>
-      </w:r>
-      <w:r>
-        <w:rPr>
-          <w:lang w:val="en-ID"/>
-        </w:rPr>
-        <w:t>Data Master</w:t>
-      </w:r>
-      <w:r>
-        <w:rPr>
-          <w:lang w:val="en-ID"/>
-        </w:rPr>
-        <w:t xml:space="preserve"> -&gt;</w:t>
-      </w:r>
-      <w:r>
-        <w:rPr>
-          <w:lang w:val="en-ID"/>
-        </w:rPr>
-        <w:t xml:space="preserve">Master </w:t>
+        <w:t xml:space="preserve"> menu Data Master -&gt;Master </w:t>
       </w:r>
       <w:proofErr w:type="spellStart"/>
       <w:r>
@@ -12047,13 +11971,7 @@
         <w:rPr>
           <w:lang w:val="en-ID"/>
         </w:rPr>
-        <w:t xml:space="preserve">Di </w:t>
-      </w:r>
-      <w:r>
-        <w:rPr>
-          <w:lang w:val="en-ID"/>
-        </w:rPr>
-        <w:t xml:space="preserve">menu </w:t>
+        <w:t xml:space="preserve">Di menu </w:t>
       </w:r>
       <w:proofErr w:type="spellStart"/>
       <w:r>
@@ -12279,13 +12197,7 @@
         <w:rPr>
           <w:lang w:val="en-ID"/>
         </w:rPr>
-        <w:t xml:space="preserve"> </w:t>
-      </w:r>
-      <w:r>
-        <w:rPr>
-          <w:lang w:val="en-ID"/>
-        </w:rPr>
-        <w:t xml:space="preserve">master </w:t>
+        <w:t xml:space="preserve"> master </w:t>
       </w:r>
       <w:proofErr w:type="spellStart"/>
       <w:r>
@@ -12725,19 +12637,7 @@
         <w:rPr>
           <w:lang w:val="en-ID"/>
         </w:rPr>
-        <w:t xml:space="preserve"> menu Data Master -&gt;</w:t>
-      </w:r>
-      <w:r>
-        <w:rPr>
-          <w:lang w:val="en-ID"/>
-        </w:rPr>
-        <w:t xml:space="preserve"> </w:t>
-      </w:r>
-      <w:r>
-        <w:rPr>
-          <w:lang w:val="en-ID"/>
-        </w:rPr>
-        <w:t xml:space="preserve">Master </w:t>
+        <w:t xml:space="preserve"> menu Data Master -&gt; Master </w:t>
       </w:r>
       <w:proofErr w:type="spellStart"/>
       <w:r>
@@ -13669,13 +13569,7 @@
         <w:rPr>
           <w:lang w:val="en-ID"/>
         </w:rPr>
-        <w:t xml:space="preserve"> master </w:t>
-      </w:r>
-      <w:r>
-        <w:rPr>
-          <w:lang w:val="en-ID"/>
-        </w:rPr>
-        <w:t xml:space="preserve">parameter </w:t>
+        <w:t xml:space="preserve"> master parameter </w:t>
       </w:r>
       <w:proofErr w:type="spellStart"/>
       <w:r>
@@ -13761,13 +13655,7 @@
         <w:rPr>
           <w:lang w:val="en-ID"/>
         </w:rPr>
-        <w:t xml:space="preserve"> menu Data Master -&gt; </w:t>
-      </w:r>
-      <w:r>
-        <w:rPr>
-          <w:lang w:val="en-ID"/>
-        </w:rPr>
-        <w:t xml:space="preserve">Parameter </w:t>
+        <w:t xml:space="preserve"> menu Data Master -&gt; Parameter </w:t>
       </w:r>
       <w:proofErr w:type="spellStart"/>
       <w:r>
@@ -14883,19 +14771,7 @@
         <w:rPr>
           <w:lang w:val="en-ID"/>
         </w:rPr>
-        <w:t xml:space="preserve"> menu </w:t>
-      </w:r>
-      <w:r>
-        <w:rPr>
-          <w:lang w:val="en-ID"/>
-        </w:rPr>
-        <w:t>Setting</w:t>
-      </w:r>
-      <w:r>
-        <w:rPr>
-          <w:lang w:val="en-ID"/>
-        </w:rPr>
-        <w:t xml:space="preserve"> -&gt; </w:t>
+        <w:t xml:space="preserve"> menu Setting -&gt; </w:t>
       </w:r>
       <w:r>
         <w:rPr>
@@ -15296,13 +15172,7 @@
         <w:rPr>
           <w:lang w:val="en-ID"/>
         </w:rPr>
-        <w:t xml:space="preserve"> </w:t>
-      </w:r>
-      <w:r>
-        <w:rPr>
-          <w:lang w:val="en-ID"/>
-        </w:rPr>
-        <w:t xml:space="preserve">Menu </w:t>
+        <w:t xml:space="preserve"> Menu </w:t>
       </w:r>
       <w:proofErr w:type="spellStart"/>
       <w:r>
@@ -15741,13 +15611,7 @@
         <w:rPr>
           <w:lang w:val="en-ID"/>
         </w:rPr>
-        <w:t xml:space="preserve"> </w:t>
-      </w:r>
-      <w:r>
-        <w:rPr>
-          <w:lang w:val="en-ID"/>
-        </w:rPr>
-        <w:t xml:space="preserve">Menu </w:t>
+        <w:t xml:space="preserve"> Menu </w:t>
       </w:r>
       <w:proofErr w:type="spellStart"/>
       <w:r>
@@ -16205,13 +16069,7 @@
         <w:rPr>
           <w:lang w:val="en-ID"/>
         </w:rPr>
-        <w:t xml:space="preserve"> </w:t>
-      </w:r>
-      <w:r>
-        <w:rPr>
-          <w:lang w:val="en-ID"/>
-        </w:rPr>
-        <w:t xml:space="preserve">Menu </w:t>
+        <w:t xml:space="preserve"> Menu </w:t>
       </w:r>
       <w:proofErr w:type="spellStart"/>
       <w:r>
@@ -16555,13 +16413,7 @@
         <w:rPr>
           <w:lang w:val="en-ID"/>
         </w:rPr>
-        <w:t>LHP</w:t>
-      </w:r>
-      <w:r>
-        <w:rPr>
-          <w:lang w:val="en-ID"/>
-        </w:rPr>
-        <w:t xml:space="preserve"> </w:t>
+        <w:t xml:space="preserve">LHP </w:t>
       </w:r>
       <w:proofErr w:type="spellStart"/>
       <w:r>
@@ -16993,19 +16845,7 @@
         <w:rPr>
           <w:lang w:val="en-ID"/>
         </w:rPr>
-        <w:t xml:space="preserve"> </w:t>
-      </w:r>
-      <w:r>
-        <w:rPr>
-          <w:lang w:val="en-ID"/>
-        </w:rPr>
-        <w:t>user</w:t>
-      </w:r>
-      <w:r>
-        <w:rPr>
-          <w:lang w:val="en-ID"/>
-        </w:rPr>
-        <w:t xml:space="preserve"> </w:t>
+        <w:t xml:space="preserve"> user </w:t>
       </w:r>
       <w:proofErr w:type="spellStart"/>
       <w:r>
@@ -17091,19 +16931,7 @@
         <w:rPr>
           <w:lang w:val="en-ID"/>
         </w:rPr>
-        <w:t xml:space="preserve"> -&gt;</w:t>
-      </w:r>
-      <w:r>
-        <w:rPr>
-          <w:lang w:val="en-ID"/>
-        </w:rPr>
-        <w:t>User</w:t>
-      </w:r>
-      <w:r>
-        <w:rPr>
-          <w:lang w:val="en-ID"/>
-        </w:rPr>
-        <w:t>.</w:t>
+        <w:t xml:space="preserve"> -&gt;User.</w:t>
       </w:r>
     </w:p>
     <w:p>
@@ -17392,19 +17220,7 @@
         <w:rPr>
           <w:lang w:val="en-ID"/>
         </w:rPr>
-        <w:t xml:space="preserve"> -&gt;</w:t>
-      </w:r>
-      <w:r>
-        <w:rPr>
-          <w:lang w:val="en-ID"/>
-        </w:rPr>
-        <w:t>Role</w:t>
-      </w:r>
-      <w:r>
-        <w:rPr>
-          <w:lang w:val="en-ID"/>
-        </w:rPr>
-        <w:t>.</w:t>
+        <w:t xml:space="preserve"> -&gt;Role.</w:t>
       </w:r>
     </w:p>
     <w:p>
@@ -17913,6 +17729,7 @@
   <w:style w:type="character" w:default="1" w:styleId="DefaultParagraphFont">
     <w:name w:val="Default Paragraph Font"/>
     <w:uiPriority w:val="1"/>
+    <w:semiHidden/>
     <w:unhideWhenUsed/>
   </w:style>
   <w:style w:type="table" w:default="1" w:styleId="TableNormal">
@@ -18369,6 +18186,7 @@
   <w:style w:type="character" w:default="1" w:styleId="DefaultParagraphFont">
     <w:name w:val="Default Paragraph Font"/>
     <w:uiPriority w:val="1"/>
+    <w:semiHidden/>
     <w:unhideWhenUsed/>
   </w:style>
   <w:style w:type="table" w:default="1" w:styleId="TableNormal">
@@ -18882,7 +18700,7 @@
 </file>
 
 <file path=customXml/itemProps1.xml><?xml version="1.0" encoding="utf-8"?>
-<ds:datastoreItem xmlns:ds="http://schemas.openxmlformats.org/officeDocument/2006/customXml" ds:itemID="{0311B9B1-71BC-4A48-80C7-3EC2FF246787}">
+<ds:datastoreItem xmlns:ds="http://schemas.openxmlformats.org/officeDocument/2006/customXml" ds:itemID="{D9CA7C64-1203-4714-8F4F-FF4146ED3175}">
   <ds:schemaRefs>
     <ds:schemaRef ds:uri="http://schemas.openxmlformats.org/officeDocument/2006/bibliography"/>
   </ds:schemaRefs>

</xml_diff>